<commit_message>
mise à jour de la matrice
</commit_message>
<xml_diff>
--- a/documents/documents_word/Eisenhower.docx
+++ b/documents/documents_word/Eisenhower.docx
@@ -4,7 +4,7 @@
   <w:body>
     <w:tbl>
       <w:tblPr>
-        <w:tblStyle w:val="TableGrid"/>
+        <w:tblStyle w:val="Grilledutableau"/>
         <w:tblW w:w="0" w:type="auto"/>
         <w:tblLook w:val="04A0" w:firstRow="1" w:lastRow="0" w:firstColumn="1" w:lastColumn="0" w:noHBand="0" w:noVBand="1"/>
       </w:tblPr>
@@ -143,7 +143,7 @@
           </w:tcPr>
           <w:p>
             <w:pPr>
-              <w:pStyle w:val="ListParagraph"/>
+              <w:pStyle w:val="Paragraphedeliste"/>
               <w:numPr>
                 <w:ilvl w:val="0"/>
                 <w:numId w:val="1"/>
@@ -161,7 +161,7 @@
           </w:p>
           <w:p>
             <w:pPr>
-              <w:pStyle w:val="ListParagraph"/>
+              <w:pStyle w:val="Paragraphedeliste"/>
               <w:numPr>
                 <w:ilvl w:val="0"/>
                 <w:numId w:val="1"/>
@@ -179,7 +179,7 @@
           </w:p>
           <w:p>
             <w:pPr>
-              <w:pStyle w:val="ListParagraph"/>
+              <w:pStyle w:val="Paragraphedeliste"/>
               <w:numPr>
                 <w:ilvl w:val="0"/>
                 <w:numId w:val="1"/>
@@ -203,48 +203,54 @@
           </w:tcPr>
           <w:p>
             <w:pPr>
-              <w:pStyle w:val="ListParagraph"/>
+              <w:pStyle w:val="Paragraphedeliste"/>
               <w:numPr>
                 <w:ilvl w:val="0"/>
                 <w:numId w:val="1"/>
               </w:numPr>
             </w:pPr>
             <w:r>
-              <w:t>Eisenhower</w:t>
+              <w:t>Planification du projet</w:t>
             </w:r>
           </w:p>
           <w:p>
             <w:pPr>
-              <w:pStyle w:val="ListParagraph"/>
+              <w:pStyle w:val="Paragraphedeliste"/>
               <w:numPr>
                 <w:ilvl w:val="0"/>
                 <w:numId w:val="1"/>
               </w:numPr>
             </w:pPr>
             <w:r>
-              <w:t>Gantt</w:t>
+              <w:t>Eisenhower</w:t>
             </w:r>
           </w:p>
           <w:p>
             <w:pPr>
-              <w:pStyle w:val="ListParagraph"/>
+              <w:pStyle w:val="Paragraphedeliste"/>
               <w:numPr>
                 <w:ilvl w:val="0"/>
                 <w:numId w:val="1"/>
               </w:numPr>
             </w:pPr>
             <w:r>
-              <w:t>Documentation</w:t>
+              <w:t>Gantt</w:t>
+            </w:r>
+            <w:r>
+              <w:t xml:space="preserve"> réel</w:t>
             </w:r>
           </w:p>
           <w:p>
             <w:pPr>
-              <w:pStyle w:val="ListParagraph"/>
+              <w:pStyle w:val="Paragraphedeliste"/>
               <w:numPr>
                 <w:ilvl w:val="0"/>
                 <w:numId w:val="1"/>
               </w:numPr>
             </w:pPr>
+            <w:r>
+              <w:t>Documentation</w:t>
+            </w:r>
           </w:p>
         </w:tc>
       </w:tr>
@@ -378,7 +384,7 @@
           </w:tcPr>
           <w:p>
             <w:pPr>
-              <w:pStyle w:val="ListParagraph"/>
+              <w:pStyle w:val="Paragraphedeliste"/>
               <w:numPr>
                 <w:ilvl w:val="0"/>
                 <w:numId w:val="4"/>
@@ -396,7 +402,7 @@
           </w:tcPr>
           <w:p>
             <w:pPr>
-              <w:pStyle w:val="ListParagraph"/>
+              <w:pStyle w:val="Paragraphedeliste"/>
               <w:numPr>
                 <w:ilvl w:val="0"/>
                 <w:numId w:val="2"/>
@@ -407,6 +413,18 @@
             </w:r>
             <w:r>
               <w:t>iki</w:t>
+            </w:r>
+          </w:p>
+          <w:p>
+            <w:pPr>
+              <w:pStyle w:val="Paragraphedeliste"/>
+              <w:numPr>
+                <w:ilvl w:val="0"/>
+                <w:numId w:val="2"/>
+              </w:numPr>
+            </w:pPr>
+            <w:r>
+              <w:t>Gant prévisionnel</w:t>
             </w:r>
           </w:p>
         </w:tc>
@@ -541,7 +559,7 @@
   <w:abstractNum w:abstractNumId="1" w15:restartNumberingAfterBreak="0">
     <w:nsid w:val="49300BA4"/>
     <w:multiLevelType w:val="hybridMultilevel"/>
-    <w:tmpl w:val="2F8EB072"/>
+    <w:tmpl w:val="167CE924"/>
     <w:lvl w:ilvl="0" w:tplc="100C0001">
       <w:start w:val="1"/>
       <w:numFmt w:val="bullet"/>
@@ -1293,11 +1311,11 @@
     <w:name w:val="Normal"/>
     <w:qFormat/>
   </w:style>
-  <w:style w:type="paragraph" w:styleId="Heading1">
+  <w:style w:type="paragraph" w:styleId="Titre1">
     <w:name w:val="heading 1"/>
     <w:basedOn w:val="Normal"/>
     <w:next w:val="Normal"/>
-    <w:link w:val="Heading1Char"/>
+    <w:link w:val="Titre1Car"/>
     <w:uiPriority w:val="9"/>
     <w:qFormat/>
     <w:rsid w:val="00514CB0"/>
@@ -1314,11 +1332,11 @@
       <w:szCs w:val="40"/>
     </w:rPr>
   </w:style>
-  <w:style w:type="paragraph" w:styleId="Heading2">
+  <w:style w:type="paragraph" w:styleId="Titre2">
     <w:name w:val="heading 2"/>
     <w:basedOn w:val="Normal"/>
     <w:next w:val="Normal"/>
-    <w:link w:val="Heading2Char"/>
+    <w:link w:val="Titre2Car"/>
     <w:uiPriority w:val="9"/>
     <w:semiHidden/>
     <w:unhideWhenUsed/>
@@ -1337,11 +1355,11 @@
       <w:szCs w:val="32"/>
     </w:rPr>
   </w:style>
-  <w:style w:type="paragraph" w:styleId="Heading3">
+  <w:style w:type="paragraph" w:styleId="Titre3">
     <w:name w:val="heading 3"/>
     <w:basedOn w:val="Normal"/>
     <w:next w:val="Normal"/>
-    <w:link w:val="Heading3Char"/>
+    <w:link w:val="Titre3Car"/>
     <w:uiPriority w:val="9"/>
     <w:semiHidden/>
     <w:unhideWhenUsed/>
@@ -1360,11 +1378,11 @@
       <w:szCs w:val="28"/>
     </w:rPr>
   </w:style>
-  <w:style w:type="paragraph" w:styleId="Heading4">
+  <w:style w:type="paragraph" w:styleId="Titre4">
     <w:name w:val="heading 4"/>
     <w:basedOn w:val="Normal"/>
     <w:next w:val="Normal"/>
-    <w:link w:val="Heading4Char"/>
+    <w:link w:val="Titre4Car"/>
     <w:uiPriority w:val="9"/>
     <w:semiHidden/>
     <w:unhideWhenUsed/>
@@ -1383,11 +1401,11 @@
       <w:color w:val="0F4761" w:themeColor="accent1" w:themeShade="BF"/>
     </w:rPr>
   </w:style>
-  <w:style w:type="paragraph" w:styleId="Heading5">
+  <w:style w:type="paragraph" w:styleId="Titre5">
     <w:name w:val="heading 5"/>
     <w:basedOn w:val="Normal"/>
     <w:next w:val="Normal"/>
-    <w:link w:val="Heading5Char"/>
+    <w:link w:val="Titre5Car"/>
     <w:uiPriority w:val="9"/>
     <w:semiHidden/>
     <w:unhideWhenUsed/>
@@ -1404,11 +1422,11 @@
       <w:color w:val="0F4761" w:themeColor="accent1" w:themeShade="BF"/>
     </w:rPr>
   </w:style>
-  <w:style w:type="paragraph" w:styleId="Heading6">
+  <w:style w:type="paragraph" w:styleId="Titre6">
     <w:name w:val="heading 6"/>
     <w:basedOn w:val="Normal"/>
     <w:next w:val="Normal"/>
-    <w:link w:val="Heading6Char"/>
+    <w:link w:val="Titre6Car"/>
     <w:uiPriority w:val="9"/>
     <w:semiHidden/>
     <w:unhideWhenUsed/>
@@ -1427,11 +1445,11 @@
       <w:color w:val="595959" w:themeColor="text1" w:themeTint="A6"/>
     </w:rPr>
   </w:style>
-  <w:style w:type="paragraph" w:styleId="Heading7">
+  <w:style w:type="paragraph" w:styleId="Titre7">
     <w:name w:val="heading 7"/>
     <w:basedOn w:val="Normal"/>
     <w:next w:val="Normal"/>
-    <w:link w:val="Heading7Char"/>
+    <w:link w:val="Titre7Car"/>
     <w:uiPriority w:val="9"/>
     <w:semiHidden/>
     <w:unhideWhenUsed/>
@@ -1448,11 +1466,11 @@
       <w:color w:val="595959" w:themeColor="text1" w:themeTint="A6"/>
     </w:rPr>
   </w:style>
-  <w:style w:type="paragraph" w:styleId="Heading8">
+  <w:style w:type="paragraph" w:styleId="Titre8">
     <w:name w:val="heading 8"/>
     <w:basedOn w:val="Normal"/>
     <w:next w:val="Normal"/>
-    <w:link w:val="Heading8Char"/>
+    <w:link w:val="Titre8Car"/>
     <w:uiPriority w:val="9"/>
     <w:semiHidden/>
     <w:unhideWhenUsed/>
@@ -1471,11 +1489,11 @@
       <w:color w:val="272727" w:themeColor="text1" w:themeTint="D8"/>
     </w:rPr>
   </w:style>
-  <w:style w:type="paragraph" w:styleId="Heading9">
+  <w:style w:type="paragraph" w:styleId="Titre9">
     <w:name w:val="heading 9"/>
     <w:basedOn w:val="Normal"/>
     <w:next w:val="Normal"/>
-    <w:link w:val="Heading9Char"/>
+    <w:link w:val="Titre9Car"/>
     <w:uiPriority w:val="9"/>
     <w:semiHidden/>
     <w:unhideWhenUsed/>
@@ -1492,13 +1510,13 @@
       <w:color w:val="272727" w:themeColor="text1" w:themeTint="D8"/>
     </w:rPr>
   </w:style>
-  <w:style w:type="character" w:default="1" w:styleId="DefaultParagraphFont">
+  <w:style w:type="character" w:default="1" w:styleId="Policepardfaut">
     <w:name w:val="Default Paragraph Font"/>
     <w:uiPriority w:val="1"/>
     <w:semiHidden/>
     <w:unhideWhenUsed/>
   </w:style>
-  <w:style w:type="table" w:default="1" w:styleId="TableNormal">
+  <w:style w:type="table" w:default="1" w:styleId="TableauNormal">
     <w:name w:val="Normal Table"/>
     <w:uiPriority w:val="99"/>
     <w:semiHidden/>
@@ -1513,16 +1531,16 @@
       </w:tblCellMar>
     </w:tblPr>
   </w:style>
-  <w:style w:type="numbering" w:default="1" w:styleId="NoList">
+  <w:style w:type="numbering" w:default="1" w:styleId="Aucuneliste">
     <w:name w:val="No List"/>
     <w:uiPriority w:val="99"/>
     <w:semiHidden/>
     <w:unhideWhenUsed/>
   </w:style>
-  <w:style w:type="character" w:customStyle="1" w:styleId="Heading1Char">
-    <w:name w:val="Heading 1 Char"/>
-    <w:basedOn w:val="DefaultParagraphFont"/>
-    <w:link w:val="Heading1"/>
+  <w:style w:type="character" w:customStyle="1" w:styleId="Titre1Car">
+    <w:name w:val="Titre 1 Car"/>
+    <w:basedOn w:val="Policepardfaut"/>
+    <w:link w:val="Titre1"/>
     <w:uiPriority w:val="9"/>
     <w:rsid w:val="00514CB0"/>
     <w:rPr>
@@ -1532,10 +1550,10 @@
       <w:szCs w:val="40"/>
     </w:rPr>
   </w:style>
-  <w:style w:type="character" w:customStyle="1" w:styleId="Heading2Char">
-    <w:name w:val="Heading 2 Char"/>
-    <w:basedOn w:val="DefaultParagraphFont"/>
-    <w:link w:val="Heading2"/>
+  <w:style w:type="character" w:customStyle="1" w:styleId="Titre2Car">
+    <w:name w:val="Titre 2 Car"/>
+    <w:basedOn w:val="Policepardfaut"/>
+    <w:link w:val="Titre2"/>
     <w:uiPriority w:val="9"/>
     <w:semiHidden/>
     <w:rsid w:val="00514CB0"/>
@@ -1546,10 +1564,10 @@
       <w:szCs w:val="32"/>
     </w:rPr>
   </w:style>
-  <w:style w:type="character" w:customStyle="1" w:styleId="Heading3Char">
-    <w:name w:val="Heading 3 Char"/>
-    <w:basedOn w:val="DefaultParagraphFont"/>
-    <w:link w:val="Heading3"/>
+  <w:style w:type="character" w:customStyle="1" w:styleId="Titre3Car">
+    <w:name w:val="Titre 3 Car"/>
+    <w:basedOn w:val="Policepardfaut"/>
+    <w:link w:val="Titre3"/>
     <w:uiPriority w:val="9"/>
     <w:semiHidden/>
     <w:rsid w:val="00514CB0"/>
@@ -1560,10 +1578,10 @@
       <w:szCs w:val="28"/>
     </w:rPr>
   </w:style>
-  <w:style w:type="character" w:customStyle="1" w:styleId="Heading4Char">
-    <w:name w:val="Heading 4 Char"/>
-    <w:basedOn w:val="DefaultParagraphFont"/>
-    <w:link w:val="Heading4"/>
+  <w:style w:type="character" w:customStyle="1" w:styleId="Titre4Car">
+    <w:name w:val="Titre 4 Car"/>
+    <w:basedOn w:val="Policepardfaut"/>
+    <w:link w:val="Titre4"/>
     <w:uiPriority w:val="9"/>
     <w:semiHidden/>
     <w:rsid w:val="00514CB0"/>
@@ -1574,10 +1592,10 @@
       <w:color w:val="0F4761" w:themeColor="accent1" w:themeShade="BF"/>
     </w:rPr>
   </w:style>
-  <w:style w:type="character" w:customStyle="1" w:styleId="Heading5Char">
-    <w:name w:val="Heading 5 Char"/>
-    <w:basedOn w:val="DefaultParagraphFont"/>
-    <w:link w:val="Heading5"/>
+  <w:style w:type="character" w:customStyle="1" w:styleId="Titre5Car">
+    <w:name w:val="Titre 5 Car"/>
+    <w:basedOn w:val="Policepardfaut"/>
+    <w:link w:val="Titre5"/>
     <w:uiPriority w:val="9"/>
     <w:semiHidden/>
     <w:rsid w:val="00514CB0"/>
@@ -1586,10 +1604,10 @@
       <w:color w:val="0F4761" w:themeColor="accent1" w:themeShade="BF"/>
     </w:rPr>
   </w:style>
-  <w:style w:type="character" w:customStyle="1" w:styleId="Heading6Char">
-    <w:name w:val="Heading 6 Char"/>
-    <w:basedOn w:val="DefaultParagraphFont"/>
-    <w:link w:val="Heading6"/>
+  <w:style w:type="character" w:customStyle="1" w:styleId="Titre6Car">
+    <w:name w:val="Titre 6 Car"/>
+    <w:basedOn w:val="Policepardfaut"/>
+    <w:link w:val="Titre6"/>
     <w:uiPriority w:val="9"/>
     <w:semiHidden/>
     <w:rsid w:val="00514CB0"/>
@@ -1600,10 +1618,10 @@
       <w:color w:val="595959" w:themeColor="text1" w:themeTint="A6"/>
     </w:rPr>
   </w:style>
-  <w:style w:type="character" w:customStyle="1" w:styleId="Heading7Char">
-    <w:name w:val="Heading 7 Char"/>
-    <w:basedOn w:val="DefaultParagraphFont"/>
-    <w:link w:val="Heading7"/>
+  <w:style w:type="character" w:customStyle="1" w:styleId="Titre7Car">
+    <w:name w:val="Titre 7 Car"/>
+    <w:basedOn w:val="Policepardfaut"/>
+    <w:link w:val="Titre7"/>
     <w:uiPriority w:val="9"/>
     <w:semiHidden/>
     <w:rsid w:val="00514CB0"/>
@@ -1612,10 +1630,10 @@
       <w:color w:val="595959" w:themeColor="text1" w:themeTint="A6"/>
     </w:rPr>
   </w:style>
-  <w:style w:type="character" w:customStyle="1" w:styleId="Heading8Char">
-    <w:name w:val="Heading 8 Char"/>
-    <w:basedOn w:val="DefaultParagraphFont"/>
-    <w:link w:val="Heading8"/>
+  <w:style w:type="character" w:customStyle="1" w:styleId="Titre8Car">
+    <w:name w:val="Titre 8 Car"/>
+    <w:basedOn w:val="Policepardfaut"/>
+    <w:link w:val="Titre8"/>
     <w:uiPriority w:val="9"/>
     <w:semiHidden/>
     <w:rsid w:val="00514CB0"/>
@@ -1626,10 +1644,10 @@
       <w:color w:val="272727" w:themeColor="text1" w:themeTint="D8"/>
     </w:rPr>
   </w:style>
-  <w:style w:type="character" w:customStyle="1" w:styleId="Heading9Char">
-    <w:name w:val="Heading 9 Char"/>
-    <w:basedOn w:val="DefaultParagraphFont"/>
-    <w:link w:val="Heading9"/>
+  <w:style w:type="character" w:customStyle="1" w:styleId="Titre9Car">
+    <w:name w:val="Titre 9 Car"/>
+    <w:basedOn w:val="Policepardfaut"/>
+    <w:link w:val="Titre9"/>
     <w:uiPriority w:val="9"/>
     <w:semiHidden/>
     <w:rsid w:val="00514CB0"/>
@@ -1638,11 +1656,11 @@
       <w:color w:val="272727" w:themeColor="text1" w:themeTint="D8"/>
     </w:rPr>
   </w:style>
-  <w:style w:type="paragraph" w:styleId="Title">
+  <w:style w:type="paragraph" w:styleId="Titre">
     <w:name w:val="Title"/>
     <w:basedOn w:val="Normal"/>
     <w:next w:val="Normal"/>
-    <w:link w:val="TitleChar"/>
+    <w:link w:val="TitreCar"/>
     <w:uiPriority w:val="10"/>
     <w:qFormat/>
     <w:rsid w:val="00514CB0"/>
@@ -1658,10 +1676,10 @@
       <w:szCs w:val="56"/>
     </w:rPr>
   </w:style>
-  <w:style w:type="character" w:customStyle="1" w:styleId="TitleChar">
-    <w:name w:val="Title Char"/>
-    <w:basedOn w:val="DefaultParagraphFont"/>
-    <w:link w:val="Title"/>
+  <w:style w:type="character" w:customStyle="1" w:styleId="TitreCar">
+    <w:name w:val="Titre Car"/>
+    <w:basedOn w:val="Policepardfaut"/>
+    <w:link w:val="Titre"/>
     <w:uiPriority w:val="10"/>
     <w:rsid w:val="00514CB0"/>
     <w:rPr>
@@ -1672,11 +1690,11 @@
       <w:szCs w:val="56"/>
     </w:rPr>
   </w:style>
-  <w:style w:type="paragraph" w:styleId="Subtitle">
+  <w:style w:type="paragraph" w:styleId="Sous-titre">
     <w:name w:val="Subtitle"/>
     <w:basedOn w:val="Normal"/>
     <w:next w:val="Normal"/>
-    <w:link w:val="SubtitleChar"/>
+    <w:link w:val="Sous-titreCar"/>
     <w:uiPriority w:val="11"/>
     <w:qFormat/>
     <w:rsid w:val="00514CB0"/>
@@ -1693,10 +1711,10 @@
       <w:szCs w:val="28"/>
     </w:rPr>
   </w:style>
-  <w:style w:type="character" w:customStyle="1" w:styleId="SubtitleChar">
-    <w:name w:val="Subtitle Char"/>
-    <w:basedOn w:val="DefaultParagraphFont"/>
-    <w:link w:val="Subtitle"/>
+  <w:style w:type="character" w:customStyle="1" w:styleId="Sous-titreCar">
+    <w:name w:val="Sous-titre Car"/>
+    <w:basedOn w:val="Policepardfaut"/>
+    <w:link w:val="Sous-titre"/>
     <w:uiPriority w:val="11"/>
     <w:rsid w:val="00514CB0"/>
     <w:rPr>
@@ -1707,11 +1725,11 @@
       <w:szCs w:val="28"/>
     </w:rPr>
   </w:style>
-  <w:style w:type="paragraph" w:styleId="Quote">
+  <w:style w:type="paragraph" w:styleId="Citation">
     <w:name w:val="Quote"/>
     <w:basedOn w:val="Normal"/>
     <w:next w:val="Normal"/>
-    <w:link w:val="QuoteChar"/>
+    <w:link w:val="CitationCar"/>
     <w:uiPriority w:val="29"/>
     <w:qFormat/>
     <w:rsid w:val="00514CB0"/>
@@ -1725,10 +1743,10 @@
       <w:color w:val="404040" w:themeColor="text1" w:themeTint="BF"/>
     </w:rPr>
   </w:style>
-  <w:style w:type="character" w:customStyle="1" w:styleId="QuoteChar">
-    <w:name w:val="Quote Char"/>
-    <w:basedOn w:val="DefaultParagraphFont"/>
-    <w:link w:val="Quote"/>
+  <w:style w:type="character" w:customStyle="1" w:styleId="CitationCar">
+    <w:name w:val="Citation Car"/>
+    <w:basedOn w:val="Policepardfaut"/>
+    <w:link w:val="Citation"/>
     <w:uiPriority w:val="29"/>
     <w:rsid w:val="00514CB0"/>
     <w:rPr>
@@ -1737,7 +1755,7 @@
       <w:color w:val="404040" w:themeColor="text1" w:themeTint="BF"/>
     </w:rPr>
   </w:style>
-  <w:style w:type="paragraph" w:styleId="ListParagraph">
+  <w:style w:type="paragraph" w:styleId="Paragraphedeliste">
     <w:name w:val="List Paragraph"/>
     <w:basedOn w:val="Normal"/>
     <w:uiPriority w:val="34"/>
@@ -1748,9 +1766,9 @@
       <w:contextualSpacing/>
     </w:pPr>
   </w:style>
-  <w:style w:type="character" w:styleId="IntenseEmphasis">
+  <w:style w:type="character" w:styleId="Accentuationintense">
     <w:name w:val="Intense Emphasis"/>
-    <w:basedOn w:val="DefaultParagraphFont"/>
+    <w:basedOn w:val="Policepardfaut"/>
     <w:uiPriority w:val="21"/>
     <w:qFormat/>
     <w:rsid w:val="00514CB0"/>
@@ -1760,11 +1778,11 @@
       <w:color w:val="0F4761" w:themeColor="accent1" w:themeShade="BF"/>
     </w:rPr>
   </w:style>
-  <w:style w:type="paragraph" w:styleId="IntenseQuote">
+  <w:style w:type="paragraph" w:styleId="Citationintense">
     <w:name w:val="Intense Quote"/>
     <w:basedOn w:val="Normal"/>
     <w:next w:val="Normal"/>
-    <w:link w:val="IntenseQuoteChar"/>
+    <w:link w:val="CitationintenseCar"/>
     <w:uiPriority w:val="30"/>
     <w:qFormat/>
     <w:rsid w:val="00514CB0"/>
@@ -1783,10 +1801,10 @@
       <w:color w:val="0F4761" w:themeColor="accent1" w:themeShade="BF"/>
     </w:rPr>
   </w:style>
-  <w:style w:type="character" w:customStyle="1" w:styleId="IntenseQuoteChar">
-    <w:name w:val="Intense Quote Char"/>
-    <w:basedOn w:val="DefaultParagraphFont"/>
-    <w:link w:val="IntenseQuote"/>
+  <w:style w:type="character" w:customStyle="1" w:styleId="CitationintenseCar">
+    <w:name w:val="Citation intense Car"/>
+    <w:basedOn w:val="Policepardfaut"/>
+    <w:link w:val="Citationintense"/>
     <w:uiPriority w:val="30"/>
     <w:rsid w:val="00514CB0"/>
     <w:rPr>
@@ -1795,9 +1813,9 @@
       <w:color w:val="0F4761" w:themeColor="accent1" w:themeShade="BF"/>
     </w:rPr>
   </w:style>
-  <w:style w:type="character" w:styleId="IntenseReference">
+  <w:style w:type="character" w:styleId="Rfrenceintense">
     <w:name w:val="Intense Reference"/>
-    <w:basedOn w:val="DefaultParagraphFont"/>
+    <w:basedOn w:val="Policepardfaut"/>
     <w:uiPriority w:val="32"/>
     <w:qFormat/>
     <w:rsid w:val="00514CB0"/>
@@ -1809,9 +1827,9 @@
       <w:spacing w:val="5"/>
     </w:rPr>
   </w:style>
-  <w:style w:type="table" w:styleId="TableGrid">
+  <w:style w:type="table" w:styleId="Grilledutableau">
     <w:name w:val="Table Grid"/>
-    <w:basedOn w:val="TableNormal"/>
+    <w:basedOn w:val="TableauNormal"/>
     <w:uiPriority w:val="39"/>
     <w:rsid w:val="00514CB0"/>
     <w:pPr>

</xml_diff>